<commit_message>
docs: align convo pipelines and CTO briefing with latest tests
Document learner global conversation profiles, admin/runtime pipe coverage,
20/06 test campaigns (pytest + Playwright tenant/admin), and remaining gaps.

Co-authored-by: Cursor <cursoragent@cursor.com>
</commit_message>
<xml_diff>
--- a/docs-workspace/briefing_cto_convergence_hugo_2_0_tests.docx
+++ b/docs-workspace/briefing_cto_convergence_hugo_2_0_tests.docx
@@ -16,7 +16,7 @@
         <w:jc w:val="center"/>
       </w:pPr>
       <w:r>
-        <w:t>Campagne de tests complétude · 2026-06-18</w:t>
+        <w:t>Campagne de tests complétude · 2026-06-20</w:t>
       </w:r>
     </w:p>
     <w:p>
@@ -42,7 +42,7 @@
     </w:p>
     <w:p>
       <w:r>
-        <w:t>Lots documentés clusters 2 à 16 : matrice 13 domaines (V5), écarts par domaine, protocoles de test, oracles par persona. Côté produit :</w:t>
+        <w:t>Lots documentés clusters 2 à 16 + livraison 20/06 profils conversationnels globaux apprenant. Matrice 13 domaines (V6). Côté produit :</w:t>
       </w:r>
     </w:p>
     <w:p>
@@ -98,6 +98,22 @@
         <w:pStyle w:val="ListBullet"/>
       </w:pPr>
       <w:r>
+        <w:t>Profil conversationnel global apprenant (diag + réflexif + bûchage + évaluation finale) — admin + résolution runtime.</w:t>
+      </w:r>
+    </w:p>
+    <w:p>
+      <w:pPr>
+        <w:pStyle w:val="ListBullet"/>
+      </w:pPr>
+      <w:r>
+        <w:t>Affectation profil global au groupe ; fallback legacy TutorPrompt conservé.</w:t>
+      </w:r>
+    </w:p>
+    <w:p>
+      <w:pPr>
+        <w:pStyle w:val="ListBullet"/>
+      </w:pPr>
+      <w:r>
         <w:t>Interfaces formateur V0 : tableau knowledge, validation, élicitation.</w:t>
       </w:r>
     </w:p>
@@ -111,10 +127,18 @@
     </w:p>
     <w:p>
       <w:pPr>
+        <w:pStyle w:val="ListBullet"/>
+      </w:pPr>
+      <w:r>
+        <w:t>Multi-tenant : scope org, tutor-links SUPERADMIN-only, Playwright tenant 11/11 (20/06).</w:t>
+      </w:r>
+    </w:p>
+    <w:p>
+      <w:pPr>
         <w:pStyle w:val="Heading1"/>
       </w:pPr>
       <w:r>
-        <w:t>3. Résultats campagne de tests (local)</w:t>
+        <w:t>3. Résultats campagnes de tests (local)</w:t>
       </w:r>
     </w:p>
     <w:p>
@@ -172,71 +196,7 @@
           </w:tcPr>
           <w:p>
             <w:r>
-              <w:t>Backend convergence (116 tests)</w:t>
-            </w:r>
-          </w:p>
-        </w:tc>
-        <w:tc>
-          <w:tcPr>
-            <w:tcW w:type="dxa" w:w="2880"/>
-          </w:tcPr>
-          <w:p>
-            <w:r>
-              <w:t>116 PASS</w:t>
-            </w:r>
-          </w:p>
-        </w:tc>
-        <w:tc>
-          <w:tcPr>
-            <w:tcW w:type="dxa" w:w="2880"/>
-          </w:tcPr>
-          <w:p>
-            <w:r>
-              <w:t>Clusters 3/4/15/16, mémoire, CTA, RAG, observabilité, encadrants</w:t>
-            </w:r>
-          </w:p>
-        </w:tc>
-      </w:tr>
-      <w:tr>
-        <w:tc>
-          <w:tcPr>
-            <w:tcW w:type="dxa" w:w="2880"/>
-          </w:tcPr>
-          <w:p>
-            <w:r>
-              <w:t>Backend complémentaire (52 tests)</w:t>
-            </w:r>
-          </w:p>
-        </w:tc>
-        <w:tc>
-          <w:tcPr>
-            <w:tcW w:type="dxa" w:w="2880"/>
-          </w:tcPr>
-          <w:p>
-            <w:r>
-              <w:t>52 PASS</w:t>
-            </w:r>
-          </w:p>
-        </w:tc>
-        <w:tc>
-          <w:tcPr>
-            <w:tcW w:type="dxa" w:w="2880"/>
-          </w:tcPr>
-          <w:p>
-            <w:r>
-              <w:t>P0, phases, exports, quality signals, trainer API</w:t>
-            </w:r>
-          </w:p>
-        </w:tc>
-      </w:tr>
-      <w:tr>
-        <w:tc>
-          <w:tcPr>
-            <w:tcW w:type="dxa" w:w="2880"/>
-          </w:tcPr>
-          <w:p>
-            <w:r>
-              <w:t>Total backend</w:t>
+              <w:t>Backend convergence 18/06 (168 tests)</w:t>
             </w:r>
           </w:p>
         </w:tc>
@@ -256,7 +216,7 @@
           </w:tcPr>
           <w:p>
             <w:r>
-              <w:t>~2 min 15 s</w:t>
+              <w:t>Clusters 3/4/15/16, mémoire, CTA, RAG, observabilité</w:t>
             </w:r>
           </w:p>
         </w:tc>
@@ -268,7 +228,7 @@
           </w:tcPr>
           <w:p>
             <w:r>
-              <w:t>Playwright complet (20 tests)</w:t>
+              <w:t>Playwright 18/06 (20 tests)</w:t>
             </w:r>
           </w:p>
         </w:tc>
@@ -288,7 +248,7 @@
           </w:tcPr>
           <w:p>
             <w:r>
-              <w:t>Échec = libellé titre formateur obsolète dans le test, pas bug produit</w:t>
+              <w:t>FAIL = libellé titre formateur obsolète dans le test</w:t>
             </w:r>
           </w:p>
         </w:tc>
@@ -321,6 +281,166 @@
           <w:p>
             <w:r>
               <w:t>Posture, mémoire, scène, profils A1/A2/A3</w:t>
+            </w:r>
+          </w:p>
+        </w:tc>
+      </w:tr>
+      <w:tr>
+        <w:tc>
+          <w:tcPr>
+            <w:tcW w:type="dxa" w:w="2880"/>
+          </w:tcPr>
+          <w:p>
+            <w:r>
+              <w:t>Multi-tenant smoke 20/06 relaxed</w:t>
+            </w:r>
+          </w:p>
+        </w:tc>
+        <w:tc>
+          <w:tcPr>
+            <w:tcW w:type="dxa" w:w="2880"/>
+          </w:tcPr>
+          <w:p>
+            <w:r>
+              <w:t>90 PASS, 3 SKIP</w:t>
+            </w:r>
+          </w:p>
+        </w:tc>
+        <w:tc>
+          <w:tcPr>
+            <w:tcW w:type="dxa" w:w="2880"/>
+          </w:tcPr>
+          <w:p>
+            <w:r>
+              <w:t>Isolation org, tutor-links, ACL encadrants</w:t>
+            </w:r>
+          </w:p>
+        </w:tc>
+      </w:tr>
+      <w:tr>
+        <w:tc>
+          <w:tcPr>
+            <w:tcW w:type="dxa" w:w="2880"/>
+          </w:tcPr>
+          <w:p>
+            <w:r>
+              <w:t>Playwright tenant 20/06</w:t>
+            </w:r>
+          </w:p>
+        </w:tc>
+        <w:tc>
+          <w:tcPr>
+            <w:tcW w:type="dxa" w:w="2880"/>
+          </w:tcPr>
+          <w:p>
+            <w:r>
+              <w:t>11 PASS</w:t>
+            </w:r>
+          </w:p>
+        </w:tc>
+        <w:tc>
+          <w:tcPr>
+            <w:tcW w:type="dxa" w:w="2880"/>
+          </w:tcPr>
+          <w:p>
+            <w:r>
+              <w:t>SUPERADMIN switcher, ORGADMIN, TUTEUR, APPRENANT</w:t>
+            </w:r>
+          </w:p>
+        </w:tc>
+      </w:tr>
+      <w:tr>
+        <w:tc>
+          <w:tcPr>
+            <w:tcW w:type="dxa" w:w="2880"/>
+          </w:tcPr>
+          <w:p>
+            <w:r>
+              <w:t>Profils globaux 20/06</w:t>
+            </w:r>
+          </w:p>
+        </w:tc>
+        <w:tc>
+          <w:tcPr>
+            <w:tcW w:type="dxa" w:w="2880"/>
+          </w:tcPr>
+          <w:p>
+            <w:r>
+              <w:t>12 PASS dédiés</w:t>
+            </w:r>
+          </w:p>
+        </w:tc>
+        <w:tc>
+          <w:tcPr>
+            <w:tcW w:type="dxa" w:w="2880"/>
+          </w:tcPr>
+          <w:p>
+            <w:r>
+              <w:t>CRUD, résolution, legacy template, priorité session/groupe</w:t>
+            </w:r>
+          </w:p>
+        </w:tc>
+      </w:tr>
+      <w:tr>
+        <w:tc>
+          <w:tcPr>
+            <w:tcW w:type="dxa" w:w="2880"/>
+          </w:tcPr>
+          <w:p>
+            <w:r>
+              <w:t>Audit pipes convo 20/06</w:t>
+            </w:r>
+          </w:p>
+        </w:tc>
+        <w:tc>
+          <w:tcPr>
+            <w:tcW w:type="dxa" w:w="2880"/>
+          </w:tcPr>
+          <w:p>
+            <w:r>
+              <w:t>26 + 32 PASS</w:t>
+            </w:r>
+          </w:p>
+        </w:tc>
+        <w:tc>
+          <w:tcPr>
+            <w:tcW w:type="dxa" w:w="2880"/>
+          </w:tcPr>
+          <w:p>
+            <w:r>
+              <w:t>Pipeline admin↔runtime ; non-régression C15/C16</w:t>
+            </w:r>
+          </w:p>
+        </w:tc>
+      </w:tr>
+      <w:tr>
+        <w:tc>
+          <w:tcPr>
+            <w:tcW w:type="dxa" w:w="2880"/>
+          </w:tcPr>
+          <w:p>
+            <w:r>
+              <w:t>Playwright admin profils 20/06</w:t>
+            </w:r>
+          </w:p>
+        </w:tc>
+        <w:tc>
+          <w:tcPr>
+            <w:tcW w:type="dxa" w:w="2880"/>
+          </w:tcPr>
+          <w:p>
+            <w:r>
+              <w:t>4 PASS</w:t>
+            </w:r>
+          </w:p>
+        </w:tc>
+        <w:tc>
+          <w:tcPr>
+            <w:tcW w:type="dxa" w:w="2880"/>
+          </w:tcPr>
+          <w:p>
+            <w:r>
+              <w:t>Création profil + affectation groupe SUPERADMIN</w:t>
             </w:r>
           </w:p>
         </w:tc>
@@ -403,7 +523,23 @@
         <w:pStyle w:val="ListBullet"/>
       </w:pPr>
       <w:r>
-        <w:t>Tuteur / COORDO / exports orgadmin Playwright OK.</w:t>
+        <w:t>Admin profils globaux : création, édition, affectation groupe (Playwright 20/06).</w:t>
+      </w:r>
+    </w:p>
+    <w:p>
+      <w:pPr>
+        <w:pStyle w:val="ListBullet"/>
+      </w:pPr>
+      <w:r>
+        <w:t>Résolution runtime profil global → slots diag/réflexif/bûchage/éval (pytest).</w:t>
+      </w:r>
+    </w:p>
+    <w:p>
+      <w:pPr>
+        <w:pStyle w:val="ListBullet"/>
+      </w:pPr>
+      <w:r>
+        <w:t>Tuteur / COORDO / exports orgadmin Playwright OK ; tenant multi-org 11/11.</w:t>
       </w:r>
     </w:p>
     <w:p>
@@ -427,10 +563,10 @@
         <w:rPr>
           <w:b/>
         </w:rPr>
-        <w:t xml:space="preserve"> — titre attendu « Espace formateur » alors que la page affiche « Orchestrateur de connaissance ». API et tableau OK. Correction = test uniquement.</w:t>
+        <w:t xml:space="preserve"> — titre attendu obsolète. API et tableau OK. Correction = test uniquement.</w:t>
       </w:r>
       <w:r>
-        <w:t>Échec Playwright trainer smoke</w:t>
+        <w:t>Échec Playwright trainer smoke (18/06)</w:t>
       </w:r>
     </w:p>
     <w:p>
@@ -441,7 +577,7 @@
         <w:rPr>
           <w:b/>
         </w:rPr>
-        <w:t xml:space="preserve"> — parité non tranchée (A_VÉRIFIER). Oracles JSON préparés, credentials requis.</w:t>
+        <w:t xml:space="preserve"> — parité non tranchée (A_VÉRIFIER).</w:t>
       </w:r>
       <w:r>
         <w:t>Encoors / prod distante</w:t>
@@ -455,10 +591,10 @@
         <w:rPr>
           <w:b/>
         </w:rPr>
-        <w:t xml:space="preserve"> — script SQL fourni, non exécuté sur prod.</w:t>
+        <w:t xml:space="preserve"> — gate OK ; connexion DB CI/local à aligner sur rôle non-superuser.</w:t>
       </w:r>
       <w:r>
-        <w:t>RLS PostgreSQL prod</w:t>
+        <w:t>RLS PostgreSQL prod / CI strict</w:t>
       </w:r>
     </w:p>
     <w:p>
@@ -469,10 +605,80 @@
         <w:rPr>
           <w:b/>
         </w:rPr>
-        <w:t xml:space="preserve"> — P0/phases testés unitairement ; pas de campagne multi-tours avec LLM réel.</w:t>
+        <w:t xml:space="preserve"> — P0/phases testés unitairement ; pas campagne multi-tours LLM réel.</w:t>
       </w:r>
       <w:r>
         <w:t>Qualité conversationnelle bout-en-bout LLM</w:t>
+      </w:r>
+    </w:p>
+    <w:p>
+      <w:pPr>
+        <w:pStyle w:val="ListBullet"/>
+      </w:pPr>
+      <w:r>
+        <w:rPr>
+          <w:b/>
+        </w:rPr>
+        <w:t xml:space="preserve"> — hardcodés synthesis_service.py ; aucune UI (P1).</w:t>
+      </w:r>
+      <w:r>
+        <w:t>Prompts synthèse admin</w:t>
+      </w:r>
+    </w:p>
+    <w:p>
+      <w:pPr>
+        <w:pStyle w:val="ListBullet"/>
+      </w:pPr>
+      <w:r>
+        <w:rPr>
+          <w:b/>
+        </w:rPr>
+        <w:t xml:space="preserve"> — lecture seule admin ; non éditables (P2).</w:t>
+      </w:r>
+      <w:r>
+        <w:t>Paramètres orchestrateur statiques</w:t>
+      </w:r>
+    </w:p>
+    <w:p>
+      <w:pPr>
+        <w:pStyle w:val="ListBullet"/>
+      </w:pPr>
+      <w:r>
+        <w:rPr>
+          <w:b/>
+        </w:rPr>
+        <w:t xml:space="preserve"> — API CRUD sans page admin (P2).</w:t>
+      </w:r>
+      <w:r>
+        <w:t>Starter prompts admin</w:t>
+      </w:r>
+    </w:p>
+    <w:p>
+      <w:pPr>
+        <w:pStyle w:val="ListBullet"/>
+      </w:pPr>
+      <w:r>
+        <w:rPr>
+          <w:b/>
+        </w:rPr>
+        <w:t xml:space="preserve"> — backend OK ; UI org-level surtout (P1).</w:t>
+      </w:r>
+      <w:r>
+        <w:t>Policies évaluation par groupe</w:t>
+      </w:r>
+    </w:p>
+    <w:p>
+      <w:pPr>
+        <w:pStyle w:val="ListBullet"/>
+      </w:pPr>
+      <w:r>
+        <w:rPr>
+          <w:b/>
+        </w:rPr>
+        <w:t xml:space="preserve"> — modèle + résolveur ; pas d’API session (décision produit).</w:t>
+      </w:r>
+      <w:r>
+        <w:t>session.learner_conversation_profile REST</w:t>
       </w:r>
     </w:p>
     <w:p>
@@ -511,7 +717,7 @@
         <w:rPr>
           <w:b/>
         </w:rPr>
-        <w:t xml:space="preserve"> — CIBLE, pas de surface ORGADMIN dédiée.</w:t>
+        <w:t xml:space="preserve"> — CIBLE, pas surface ORGADMIN dédiée.</w:t>
       </w:r>
       <w:r>
         <w:t>Choix profil cohorte IFT-042</w:t>
@@ -525,7 +731,7 @@
         <w:rPr>
           <w:b/>
         </w:rPr>
-        <w:t xml:space="preserve"> — PARTIEL ; transitions posture OK, règle phase/tours explicite absente.</w:t>
+        <w:t xml:space="preserve"> — PARTIEL ; transitions posture OK.</w:t>
       </w:r>
       <w:r>
         <w:t>Verrou posture « séance avancée »</w:t>
@@ -583,7 +789,35 @@
         <w:t xml:space="preserve">P0 — Mise en ligne sécurisée : </w:t>
       </w:r>
       <w:r>
-        <w:t>Staging + smoke pytest + Playwright CI ; pas de prod directe.</w:t>
+        <w:t>Staging + smoke pytest + Playwright CI ; pas prod directe.</w:t>
+      </w:r>
+    </w:p>
+    <w:p>
+      <w:pPr>
+        <w:pStyle w:val="ListNumber"/>
+      </w:pPr>
+      <w:r>
+        <w:rPr>
+          <w:b/>
+        </w:rPr>
+        <w:t xml:space="preserve">P0 — CI RLS : </w:t>
+      </w:r>
+      <w:r>
+        <w:t>Aligner TEST_DB_USER sur hugo_app ; corriger fixture strict (5 ERROR connus).</w:t>
+      </w:r>
+    </w:p>
+    <w:p>
+      <w:pPr>
+        <w:pStyle w:val="ListNumber"/>
+      </w:pPr>
+      <w:r>
+        <w:rPr>
+          <w:b/>
+        </w:rPr>
+        <w:t xml:space="preserve">P1 — Pipes conversationnels : </w:t>
+      </w:r>
+      <w:r>
+        <w:t>Admin synthèse ; UI policies évaluation groupe ; corriger smoke trainer.</w:t>
       </w:r>
     </w:p>
     <w:p>
@@ -597,7 +831,7 @@
         <w:t xml:space="preserve">P1 — Stabilisation tests : </w:t>
       </w:r>
       <w:r>
-        <w:t>Corriger smoke trainer ; ajouter U16-S2b advisory ; scénarios manuels S16.</w:t>
+        <w:t>U16-S2b advisory ; scénarios manuels S16 ; Playwright message tour.</w:t>
       </w:r>
     </w:p>
     <w:p>
@@ -611,7 +845,7 @@
         <w:t xml:space="preserve">P1 — Encoors : </w:t>
       </w:r>
       <w:r>
-        <w:t>Exécuter encoors_oracle.py avec credentials ; comparer JSON local.</w:t>
+        <w:t>Oracle avec credentials ; comparer JSON local.</w:t>
       </w:r>
     </w:p>
     <w:p>
@@ -625,7 +859,7 @@
         <w:t xml:space="preserve">P2 — Qualité conversationnelle : </w:t>
       </w:r>
       <w:r>
-        <w:t>Campagne multi-configurations (postures × maturités × profils) avec LLM ou mocks documentés.</w:t>
+        <w:t>Campagne multi-configurations postures × maturités × profils.</w:t>
       </w:r>
     </w:p>
     <w:p>
@@ -636,10 +870,10 @@
         <w:rPr>
           <w:b/>
         </w:rPr>
-        <w:t xml:space="preserve">P2 — IFT-042 : </w:t>
+        <w:t xml:space="preserve">P2 — Starter prompts + orchestrateur : </w:t>
       </w:r>
       <w:r>
-        <w:t>Surface minimale choix profil cohorte.</w:t>
+        <w:t>Pages admin minimales ou décision reporter.</w:t>
       </w:r>
     </w:p>
     <w:p>
@@ -653,7 +887,7 @@
         <w:t xml:space="preserve">P3 — Couronne : </w:t>
       </w:r>
       <w:r>
-        <w:t>Intercalaires, RAG vectoriel, D9bis dashboards — hors cœur convergence.</w:t>
+        <w:t>Intercalaires, RAG vectoriel, D9bis dashboards.</w:t>
       </w:r>
     </w:p>
     <w:p>
@@ -757,7 +991,7 @@
         <w:t xml:space="preserve">Conserver avec polish : </w:t>
       </w:r>
       <w:r>
-        <w:t>PostureSelector, LearnerMemoryPanel, profils CSS, bandeau scène.</w:t>
+        <w:t>PostureSelector, LearnerMemoryPanel, profils CSS, bandeau scène, admin profils globaux.</w:t>
       </w:r>
     </w:p>
     <w:p>
@@ -768,7 +1002,7 @@
         <w:t xml:space="preserve">Compléter (pas refaire) : </w:t>
       </w:r>
       <w:r>
-        <w:t>Tests E2E advisory, verrou posture explicite backend, IFT-042, doc SW-xx.</w:t>
+        <w:t>Admin synthèse, policies eval groupe, tests E2E advisory, IFT-042, doc SW-xx.</w:t>
       </w:r>
     </w:p>
     <w:p>
@@ -806,7 +1040,7 @@
         <w:pStyle w:val="ListBullet"/>
       </w:pPr>
       <w:r>
-        <w:t>docs-workspace/README.md (§7 méthode tests)</w:t>
+        <w:t>docs-workspace/README.md (§7 méthode tests, §7.6 pipes conversationnels)</w:t>
       </w:r>
     </w:p>
     <w:p>
@@ -814,7 +1048,7 @@
         <w:pStyle w:val="ListBullet"/>
       </w:pPr>
       <w:r>
-        <w:t>docs-workspace/test_final_complétude_améliorations.md (rapport détaillé)</w:t>
+        <w:t>docs-workspace/test_final_complétude_améliorations.md (rapport 18/06 + addendum 20/06)</w:t>
       </w:r>
     </w:p>
     <w:p>
@@ -822,7 +1056,15 @@
         <w:pStyle w:val="ListBullet"/>
       </w:pPr>
       <w:r>
-        <w:t>docs-workspace/cluster2_matrice_runtime_vs_cible.md (V5)</w:t>
+        <w:t>docs-workspace/MINI_SPEC_PROFILS_CONVERSATIONNELS_APPRENANT.md</w:t>
+      </w:r>
+    </w:p>
+    <w:p>
+      <w:pPr>
+        <w:pStyle w:val="ListBullet"/>
+      </w:pPr>
+      <w:r>
+        <w:t>docs-workspace/cluster2_matrice_runtime_vs_cible.md (V6)</w:t>
       </w:r>
     </w:p>
     <w:p>
@@ -846,6 +1088,14 @@
         <w:pStyle w:val="ListBullet"/>
       </w:pPr>
       <w:r>
+        <w:t>docs-workspace/tests/archives/tests_hugo_2_0_2026-06-18_20.md</w:t>
+      </w:r>
+    </w:p>
+    <w:p>
+      <w:pPr>
+        <w:pStyle w:val="ListBullet"/>
+      </w:pPr>
+      <w:r>
         <w:t>docs-workspace/rapport_mise_a_jour_doc_post_cluster16_2026-06-18.md</w:t>
       </w:r>
     </w:p>
@@ -855,7 +1105,7 @@
         <w:rPr>
           <w:i/>
         </w:rPr>
-        <w:t>Document généré automatiquement à partir de la campagne locale du 2026-06-18. Les statuts Encoors/prod restent A_VÉRIFIER jusqu’à oracle authentifié.</w:t>
+        <w:t>Document généré automatiquement — campagnes locales 2026-06-18 (convergence) et 2026-06-20 (multi-tenant + profils globaux apprenant). Encoors/prod restent A_VÉRIFIER jusqu’à oracle authentifié.</w:t>
       </w:r>
     </w:p>
     <w:sectPr>

</xml_diff>